<commit_message>
Book: 15-agent profiles (+Cost Controller), live-deployment notes, part-divider descriptions + colophon (PartDescription style), checklist Railway/token refresh
</commit_message>
<xml_diff>
--- a/docs/_reference.docx
+++ b/docs/_reference.docx
@@ -1223,6 +1223,20 @@
       <w:color w:val="6B7280"/>
       <w:sz w:val="24"/>
       <w:szCs w:val="24"/>
+    </w:rPr>
+  </w:style>
+  <w:style w:type="paragraph" w:customStyle="1" w:styleId="PartDescription">
+    <w:name w:val="Part Description"/>
+    <w:basedOn w:val="Normal"/>
+    <w:pPr>
+      <w:jc w:val="center"/>
+      <w:spacing w:before="360" w:after="240"/>
+    </w:pPr>
+    <w:rPr>
+      <w:i/>
+      <w:color w:val="6B7280"/>
+      <w:sz w:val="26"/>
+      <w:szCs w:val="26"/>
     </w:rPr>
   </w:style>
 </w:styles>

</xml_diff>